<commit_message>
chore: update templates, add manual book, update gitignore
- Update .gitignore to exclude local files
- Add Manual Book documentation
- Update template .docx files
</commit_message>
<xml_diff>
--- a/Template surat/Surat_Keterangan_Mahasiswa_Aktif.docx
+++ b/Template surat/Surat_Keterangan_Mahasiswa_Aktif.docx
@@ -1,6 +1,6 @@
 
 <file path=word/document.xml><?xml version="1.0" encoding="utf-8"?>
-<w:document xmlns:wpc="http://schemas.microsoft.com/office/word/2010/wordprocessingCanvas" xmlns:cx="http://schemas.microsoft.com/office/drawing/2014/chartex" xmlns:cx1="http://schemas.microsoft.com/office/drawing/2015/9/8/chartex" xmlns:cx2="http://schemas.microsoft.com/office/drawing/2015/10/21/chartex" xmlns:cx3="http://schemas.microsoft.com/office/drawing/2016/5/9/chartex" xmlns:cx4="http://schemas.microsoft.com/office/drawing/2016/5/10/chartex" xmlns:cx5="http://schemas.microsoft.com/office/drawing/2016/5/11/chartex" xmlns:cx6="http://schemas.microsoft.com/office/drawing/2016/5/12/chartex" xmlns:cx7="http://schemas.microsoft.com/office/drawing/2016/5/13/chartex" xmlns:cx8="http://schemas.microsoft.com/office/drawing/2016/5/14/chartex" xmlns:mc="http://schemas.openxmlformats.org/markup-compatibility/2006" xmlns:aink="http://schemas.microsoft.com/office/drawing/2016/ink" xmlns:am3d="http://schemas.microsoft.com/office/drawing/2017/model3d" xmlns:o="urn:schemas-microsoft-com:office:office" xmlns:oel="http://schemas.microsoft.com/office/2019/extlst" xmlns:r="http://schemas.openxmlformats.org/officeDocument/2006/relationships" xmlns:m="http://schemas.openxmlformats.org/officeDocument/2006/math" xmlns:v="urn:schemas-microsoft-com:vml" xmlns:wp14="http://schemas.microsoft.com/office/word/2010/wordprocessingDrawing" xmlns:wp="http://schemas.openxmlformats.org/drawingml/2006/wordprocessingDrawing" xmlns:w10="urn:schemas-microsoft-com:office:word" xmlns:w="http://schemas.openxmlformats.org/wordprocessingml/2006/main" xmlns:w14="http://schemas.microsoft.com/office/word/2010/wordml" xmlns:w15="http://schemas.microsoft.com/office/word/2012/wordml" xmlns:w16cex="http://schemas.microsoft.com/office/word/2018/wordml/cex" xmlns:w16cid="http://schemas.microsoft.com/office/word/2016/wordml/cid" xmlns:w16="http://schemas.microsoft.com/office/word/2018/wordml" xmlns:w16du="http://schemas.microsoft.com/office/word/2023/wordml/word16du" xmlns:w16sdtdh="http://schemas.microsoft.com/office/word/2020/wordml/sdtdatahash" xmlns:w16se="http://schemas.microsoft.com/office/word/2015/wordml/symex" xmlns:wpg="http://schemas.microsoft.com/office/word/2010/wordprocessingGroup" xmlns:wpi="http://schemas.microsoft.com/office/word/2010/wordprocessingInk" xmlns:wne="http://schemas.microsoft.com/office/word/2006/wordml" xmlns:wps="http://schemas.microsoft.com/office/word/2010/wordprocessingShape" mc:Ignorable="w14 w15 w16se w16cid w16 w16cex w16sdtdh w16du wp14">
+<w:document xmlns:wpc="http://schemas.microsoft.com/office/word/2010/wordprocessingCanvas" xmlns:cx="http://schemas.microsoft.com/office/drawing/2014/chartex" xmlns:cx1="http://schemas.microsoft.com/office/drawing/2015/9/8/chartex" xmlns:cx2="http://schemas.microsoft.com/office/drawing/2015/10/21/chartex" xmlns:cx3="http://schemas.microsoft.com/office/drawing/2016/5/9/chartex" xmlns:cx4="http://schemas.microsoft.com/office/drawing/2016/5/10/chartex" xmlns:cx5="http://schemas.microsoft.com/office/drawing/2016/5/11/chartex" xmlns:cx6="http://schemas.microsoft.com/office/drawing/2016/5/12/chartex" xmlns:cx7="http://schemas.microsoft.com/office/drawing/2016/5/13/chartex" xmlns:cx8="http://schemas.microsoft.com/office/drawing/2016/5/14/chartex" xmlns:mc="http://schemas.openxmlformats.org/markup-compatibility/2006" xmlns:aink="http://schemas.microsoft.com/office/drawing/2016/ink" xmlns:am3d="http://schemas.microsoft.com/office/drawing/2017/model3d" xmlns:o="urn:schemas-microsoft-com:office:office" xmlns:oel="http://schemas.microsoft.com/office/2019/extlst" xmlns:r="http://schemas.openxmlformats.org/officeDocument/2006/relationships" xmlns:m="http://schemas.openxmlformats.org/officeDocument/2006/math" xmlns:v="urn:schemas-microsoft-com:vml" xmlns:wp14="http://schemas.microsoft.com/office/word/2010/wordprocessingDrawing" xmlns:wp="http://schemas.openxmlformats.org/drawingml/2006/wordprocessingDrawing" xmlns:w10="urn:schemas-microsoft-com:office:word" xmlns:w="http://schemas.openxmlformats.org/wordprocessingml/2006/main" xmlns:w14="http://schemas.microsoft.com/office/word/2010/wordml" xmlns:w15="http://schemas.microsoft.com/office/word/2012/wordml" xmlns:w16cex="http://schemas.microsoft.com/office/word/2018/wordml/cex" xmlns:w16cid="http://schemas.microsoft.com/office/word/2016/wordml/cid" xmlns:w16="http://schemas.microsoft.com/office/word/2018/wordml" xmlns:w16du="http://schemas.microsoft.com/office/word/2023/wordml/word16du" xmlns:w16sdtdh="http://schemas.microsoft.com/office/word/2020/wordml/sdtdatahash" xmlns:w16sdtfl="http://schemas.microsoft.com/office/word/2024/wordml/sdtformatlock" xmlns:w16se="http://schemas.microsoft.com/office/word/2015/wordml/symex" xmlns:wpg="http://schemas.microsoft.com/office/word/2010/wordprocessingGroup" xmlns:wpi="http://schemas.microsoft.com/office/word/2010/wordprocessingInk" xmlns:wne="http://schemas.microsoft.com/office/word/2006/wordml" xmlns:wps="http://schemas.microsoft.com/office/word/2010/wordprocessingShape" mc:Ignorable="w14 w15 w16se w16cid w16 w16cex w16sdtdh w16sdtfl w16du wp14">
   <w:body>
     <w:p>
       <w:pPr>
@@ -371,25 +371,7 @@
           <w:szCs w:val="24"/>
         </w:rPr>
         <w:tab/>
-        <w:t>: ${</w:t>
-      </w:r>
-      <w:proofErr w:type="spellStart"/>
-      <w:r>
-        <w:rPr>
-          <w:rFonts w:ascii="Times New Roman" w:hAnsi="Times New Roman" w:cs="Times New Roman"/>
-          <w:sz w:val="24"/>
-          <w:szCs w:val="24"/>
-        </w:rPr>
-        <w:t>nama</w:t>
-      </w:r>
-      <w:proofErr w:type="spellEnd"/>
-      <w:r>
-        <w:rPr>
-          <w:rFonts w:ascii="Times New Roman" w:hAnsi="Times New Roman" w:cs="Times New Roman"/>
-          <w:sz w:val="24"/>
-          <w:szCs w:val="24"/>
-        </w:rPr>
-        <w:t>}</w:t>
+        <w:t>: ${nama}</w:t>
       </w:r>
     </w:p>
     <w:p>
@@ -424,25 +406,7 @@
           <w:szCs w:val="24"/>
         </w:rPr>
         <w:tab/>
-        <w:t>: ${</w:t>
-      </w:r>
-      <w:proofErr w:type="spellStart"/>
-      <w:r>
-        <w:rPr>
-          <w:rFonts w:ascii="Times New Roman" w:hAnsi="Times New Roman" w:cs="Times New Roman"/>
-          <w:sz w:val="24"/>
-          <w:szCs w:val="24"/>
-        </w:rPr>
-        <w:t>nim</w:t>
-      </w:r>
-      <w:proofErr w:type="spellEnd"/>
-      <w:r>
-        <w:rPr>
-          <w:rFonts w:ascii="Times New Roman" w:hAnsi="Times New Roman" w:cs="Times New Roman"/>
-          <w:sz w:val="24"/>
-          <w:szCs w:val="24"/>
-        </w:rPr>
-        <w:t>}</w:t>
+        <w:t>: ${nim}</w:t>
       </w:r>
     </w:p>
     <w:p>
@@ -1157,6 +1121,76 @@
                 <w:noProof/>
                 <w:sz w:val="24"/>
                 <w:szCs w:val="24"/>
+              </w:rPr>
+              <w:drawing>
+                <wp:anchor distT="0" distB="0" distL="114300" distR="114300" simplePos="0" relativeHeight="251658240" behindDoc="0" locked="0" layoutInCell="1" allowOverlap="1" wp14:anchorId="40FBD11D" wp14:editId="4501B98C">
+                  <wp:simplePos x="0" y="0"/>
+                  <wp:positionH relativeFrom="column">
+                    <wp:posOffset>-76835</wp:posOffset>
+                  </wp:positionH>
+                  <wp:positionV relativeFrom="paragraph">
+                    <wp:posOffset>228600</wp:posOffset>
+                  </wp:positionV>
+                  <wp:extent cx="945515" cy="499745"/>
+                  <wp:effectExtent l="0" t="0" r="0" b="0"/>
+                  <wp:wrapNone/>
+                  <wp:docPr id="1015064922" name="Picture 1"/>
+                  <wp:cNvGraphicFramePr>
+                    <a:graphicFrameLocks xmlns:a="http://schemas.openxmlformats.org/drawingml/2006/main" noChangeAspect="1"/>
+                  </wp:cNvGraphicFramePr>
+                  <a:graphic xmlns:a="http://schemas.openxmlformats.org/drawingml/2006/main">
+                    <a:graphicData uri="http://schemas.openxmlformats.org/drawingml/2006/picture">
+                      <pic:pic xmlns:pic="http://schemas.openxmlformats.org/drawingml/2006/picture">
+                        <pic:nvPicPr>
+                          <pic:cNvPr id="0" name="Picture 1"/>
+                          <pic:cNvPicPr>
+                            <a:picLocks noChangeAspect="1" noChangeArrowheads="1"/>
+                          </pic:cNvPicPr>
+                        </pic:nvPicPr>
+                        <pic:blipFill>
+                          <a:blip r:embed="rId5" cstate="print">
+                            <a:extLst>
+                              <a:ext uri="{28A0092B-C50C-407E-A947-70E740481C1C}">
+                                <a14:useLocalDpi xmlns:a14="http://schemas.microsoft.com/office/drawing/2010/main" val="0"/>
+                              </a:ext>
+                            </a:extLst>
+                          </a:blip>
+                          <a:srcRect/>
+                          <a:stretch>
+                            <a:fillRect/>
+                          </a:stretch>
+                        </pic:blipFill>
+                        <pic:spPr bwMode="auto">
+                          <a:xfrm>
+                            <a:off x="0" y="0"/>
+                            <a:ext cx="945515" cy="499745"/>
+                          </a:xfrm>
+                          <a:prstGeom prst="rect">
+                            <a:avLst/>
+                          </a:prstGeom>
+                          <a:noFill/>
+                          <a:ln>
+                            <a:noFill/>
+                          </a:ln>
+                        </pic:spPr>
+                      </pic:pic>
+                    </a:graphicData>
+                  </a:graphic>
+                  <wp14:sizeRelH relativeFrom="page">
+                    <wp14:pctWidth>0</wp14:pctWidth>
+                  </wp14:sizeRelH>
+                  <wp14:sizeRelV relativeFrom="page">
+                    <wp14:pctHeight>0</wp14:pctHeight>
+                  </wp14:sizeRelV>
+                </wp:anchor>
+              </w:drawing>
+            </w:r>
+            <w:r>
+              <w:rPr>
+                <w:rFonts w:ascii="Times New Roman" w:hAnsi="Times New Roman" w:cs="Times New Roman"/>
+                <w:noProof/>
+                <w:sz w:val="24"/>
+                <w:szCs w:val="24"/>
                 <w:lang w:val="fi-FI"/>
               </w:rPr>
               <w:drawing>
@@ -1175,7 +1209,7 @@
                           <pic:cNvPicPr/>
                         </pic:nvPicPr>
                         <pic:blipFill rotWithShape="1">
-                          <a:blip r:embed="rId5" cstate="print">
+                          <a:blip r:embed="rId6" cstate="print">
                             <a:extLst>
                               <a:ext uri="{28A0092B-C50C-407E-A947-70E740481C1C}">
                                 <a14:useLocalDpi xmlns:a14="http://schemas.microsoft.com/office/drawing/2010/main" val="0"/>
@@ -1297,7 +1331,7 @@
 </file>
 
 <file path=word/styles.xml><?xml version="1.0" encoding="utf-8"?>
-<w:styles xmlns:mc="http://schemas.openxmlformats.org/markup-compatibility/2006" xmlns:r="http://schemas.openxmlformats.org/officeDocument/2006/relationships" xmlns:w="http://schemas.openxmlformats.org/wordprocessingml/2006/main" xmlns:w14="http://schemas.microsoft.com/office/word/2010/wordml" xmlns:w15="http://schemas.microsoft.com/office/word/2012/wordml" xmlns:w16cex="http://schemas.microsoft.com/office/word/2018/wordml/cex" xmlns:w16cid="http://schemas.microsoft.com/office/word/2016/wordml/cid" xmlns:w16="http://schemas.microsoft.com/office/word/2018/wordml" xmlns:w16du="http://schemas.microsoft.com/office/word/2023/wordml/word16du" xmlns:w16sdtdh="http://schemas.microsoft.com/office/word/2020/wordml/sdtdatahash" xmlns:w16se="http://schemas.microsoft.com/office/word/2015/wordml/symex" mc:Ignorable="w14 w15 w16se w16cid w16 w16cex w16sdtdh w16du">
+<w:styles xmlns:mc="http://schemas.openxmlformats.org/markup-compatibility/2006" xmlns:r="http://schemas.openxmlformats.org/officeDocument/2006/relationships" xmlns:w="http://schemas.openxmlformats.org/wordprocessingml/2006/main" xmlns:w14="http://schemas.microsoft.com/office/word/2010/wordml" xmlns:w15="http://schemas.microsoft.com/office/word/2012/wordml" xmlns:w16cex="http://schemas.microsoft.com/office/word/2018/wordml/cex" xmlns:w16cid="http://schemas.microsoft.com/office/word/2016/wordml/cid" xmlns:w16="http://schemas.microsoft.com/office/word/2018/wordml" xmlns:w16du="http://schemas.microsoft.com/office/word/2023/wordml/word16du" xmlns:w16sdtdh="http://schemas.microsoft.com/office/word/2020/wordml/sdtdatahash" xmlns:w16sdtfl="http://schemas.microsoft.com/office/word/2024/wordml/sdtformatlock" xmlns:w16se="http://schemas.microsoft.com/office/word/2015/wordml/symex" mc:Ignorable="w14 w15 w16se w16cid w16 w16cex w16sdtdh w16sdtfl w16du">
   <w:docDefaults>
     <w:rPrDefault>
       <w:rPr>

</xml_diff>

<commit_message>
chore: update template surat dan manual book
</commit_message>
<xml_diff>
--- a/Template surat/Surat_Keterangan_Mahasiswa_Aktif.docx
+++ b/Template surat/Surat_Keterangan_Mahasiswa_Aktif.docx
@@ -1,6 +1,6 @@
 
 <file path=word/document.xml><?xml version="1.0" encoding="utf-8"?>
-<w:document xmlns:wpc="http://schemas.microsoft.com/office/word/2010/wordprocessingCanvas" xmlns:cx="http://schemas.microsoft.com/office/drawing/2014/chartex" xmlns:cx1="http://schemas.microsoft.com/office/drawing/2015/9/8/chartex" xmlns:cx2="http://schemas.microsoft.com/office/drawing/2015/10/21/chartex" xmlns:cx3="http://schemas.microsoft.com/office/drawing/2016/5/9/chartex" xmlns:cx4="http://schemas.microsoft.com/office/drawing/2016/5/10/chartex" xmlns:cx5="http://schemas.microsoft.com/office/drawing/2016/5/11/chartex" xmlns:cx6="http://schemas.microsoft.com/office/drawing/2016/5/12/chartex" xmlns:cx7="http://schemas.microsoft.com/office/drawing/2016/5/13/chartex" xmlns:cx8="http://schemas.microsoft.com/office/drawing/2016/5/14/chartex" xmlns:mc="http://schemas.openxmlformats.org/markup-compatibility/2006" xmlns:aink="http://schemas.microsoft.com/office/drawing/2016/ink" xmlns:am3d="http://schemas.microsoft.com/office/drawing/2017/model3d" xmlns:o="urn:schemas-microsoft-com:office:office" xmlns:oel="http://schemas.microsoft.com/office/2019/extlst" xmlns:r="http://schemas.openxmlformats.org/officeDocument/2006/relationships" xmlns:m="http://schemas.openxmlformats.org/officeDocument/2006/math" xmlns:v="urn:schemas-microsoft-com:vml" xmlns:wp14="http://schemas.microsoft.com/office/word/2010/wordprocessingDrawing" xmlns:wp="http://schemas.openxmlformats.org/drawingml/2006/wordprocessingDrawing" xmlns:w10="urn:schemas-microsoft-com:office:word" xmlns:w="http://schemas.openxmlformats.org/wordprocessingml/2006/main" xmlns:w14="http://schemas.microsoft.com/office/word/2010/wordml" xmlns:w15="http://schemas.microsoft.com/office/word/2012/wordml" xmlns:w16cex="http://schemas.microsoft.com/office/word/2018/wordml/cex" xmlns:w16cid="http://schemas.microsoft.com/office/word/2016/wordml/cid" xmlns:w16="http://schemas.microsoft.com/office/word/2018/wordml" xmlns:w16du="http://schemas.microsoft.com/office/word/2023/wordml/word16du" xmlns:w16sdtdh="http://schemas.microsoft.com/office/word/2020/wordml/sdtdatahash" xmlns:w16sdtfl="http://schemas.microsoft.com/office/word/2024/wordml/sdtformatlock" xmlns:w16se="http://schemas.microsoft.com/office/word/2015/wordml/symex" xmlns:wpg="http://schemas.microsoft.com/office/word/2010/wordprocessingGroup" xmlns:wpi="http://schemas.microsoft.com/office/word/2010/wordprocessingInk" xmlns:wne="http://schemas.microsoft.com/office/word/2006/wordml" xmlns:wps="http://schemas.microsoft.com/office/word/2010/wordprocessingShape" mc:Ignorable="w14 w15 w16se w16cid w16 w16cex w16sdtdh w16sdtfl w16du wp14">
+<w:document xmlns:wpc="http://schemas.microsoft.com/office/word/2010/wordprocessingCanvas" xmlns:cx="http://schemas.microsoft.com/office/drawing/2014/chartex" xmlns:cx1="http://schemas.microsoft.com/office/drawing/2015/9/8/chartex" xmlns:cx2="http://schemas.microsoft.com/office/drawing/2015/10/21/chartex" xmlns:cx3="http://schemas.microsoft.com/office/drawing/2016/5/9/chartex" xmlns:cx4="http://schemas.microsoft.com/office/drawing/2016/5/10/chartex" xmlns:cx5="http://schemas.microsoft.com/office/drawing/2016/5/11/chartex" xmlns:cx6="http://schemas.microsoft.com/office/drawing/2016/5/12/chartex" xmlns:cx7="http://schemas.microsoft.com/office/drawing/2016/5/13/chartex" xmlns:cx8="http://schemas.microsoft.com/office/drawing/2016/5/14/chartex" xmlns:mc="http://schemas.openxmlformats.org/markup-compatibility/2006" xmlns:aink="http://schemas.microsoft.com/office/drawing/2016/ink" xmlns:am3d="http://schemas.microsoft.com/office/drawing/2017/model3d" xmlns:o="urn:schemas-microsoft-com:office:office" xmlns:oel="http://schemas.microsoft.com/office/2019/extlst" xmlns:r="http://schemas.openxmlformats.org/officeDocument/2006/relationships" xmlns:m="http://schemas.openxmlformats.org/officeDocument/2006/math" xmlns:v="urn:schemas-microsoft-com:vml" xmlns:wp14="http://schemas.microsoft.com/office/word/2010/wordprocessingDrawing" xmlns:wp="http://schemas.openxmlformats.org/drawingml/2006/wordprocessingDrawing" xmlns:w10="urn:schemas-microsoft-com:office:word" xmlns:w="http://schemas.openxmlformats.org/wordprocessingml/2006/main" xmlns:w14="http://schemas.microsoft.com/office/word/2010/wordml" xmlns:w15="http://schemas.microsoft.com/office/word/2012/wordml" xmlns:w16cex="http://schemas.microsoft.com/office/word/2018/wordml/cex" xmlns:w16cid="http://schemas.microsoft.com/office/word/2016/wordml/cid" xmlns:w16="http://schemas.microsoft.com/office/word/2018/wordml" xmlns:w16du="http://schemas.microsoft.com/office/word/2023/wordml/word16du" xmlns:w16sdtdh="http://schemas.microsoft.com/office/word/2020/wordml/sdtdatahash" xmlns:w16se="http://schemas.microsoft.com/office/word/2015/wordml/symex" xmlns:wpg="http://schemas.microsoft.com/office/word/2010/wordprocessingGroup" xmlns:wpi="http://schemas.microsoft.com/office/word/2010/wordprocessingInk" xmlns:wne="http://schemas.microsoft.com/office/word/2006/wordml" xmlns:wps="http://schemas.microsoft.com/office/word/2010/wordprocessingShape" mc:Ignorable="w14 w15 w16se w16cid w16 w16cex w16sdtdh w16du wp14">
   <w:body>
     <w:p>
       <w:pPr>
@@ -1019,21 +1019,19 @@
           <w:tcPr>
             <w:tcW w:w="3426" w:type="dxa"/>
             <w:vAlign w:val="center"/>
+            <w:hideMark/>
           </w:tcPr>
           <w:p>
             <w:pPr>
+              <w:spacing w:after="0" w:line="360" w:lineRule="auto"/>
               <w:jc w:val="center"/>
               <w:rPr>
                 <w:rFonts w:ascii="Times New Roman" w:hAnsi="Times New Roman" w:cs="Times New Roman"/>
-                <w:sz w:val="24"/>
-                <w:szCs w:val="24"/>
               </w:rPr>
             </w:pPr>
             <w:r>
               <w:rPr>
                 <w:rFonts w:ascii="Times New Roman" w:hAnsi="Times New Roman" w:cs="Times New Roman"/>
-                <w:sz w:val="24"/>
-                <w:szCs w:val="24"/>
               </w:rPr>
               <w:t>Bandung, ${</w:t>
             </w:r>
@@ -1041,8 +1039,6 @@
             <w:r>
               <w:rPr>
                 <w:rFonts w:ascii="Times New Roman" w:hAnsi="Times New Roman" w:cs="Times New Roman"/>
-                <w:sz w:val="24"/>
-                <w:szCs w:val="24"/>
               </w:rPr>
               <w:t>tanggal</w:t>
             </w:r>
@@ -1050,8 +1046,6 @@
             <w:r>
               <w:rPr>
                 <w:rFonts w:ascii="Times New Roman" w:hAnsi="Times New Roman" w:cs="Times New Roman"/>
-                <w:sz w:val="24"/>
-                <w:szCs w:val="24"/>
               </w:rPr>
               <w:t>}</w:t>
             </w:r>
@@ -1066,22 +1060,20 @@
           <w:tcPr>
             <w:tcW w:w="3426" w:type="dxa"/>
             <w:vAlign w:val="center"/>
+            <w:hideMark/>
           </w:tcPr>
           <w:p>
             <w:pPr>
+              <w:spacing w:line="360" w:lineRule="auto"/>
               <w:jc w:val="center"/>
               <w:rPr>
                 <w:rFonts w:ascii="Times New Roman" w:hAnsi="Times New Roman" w:cs="Times New Roman"/>
-                <w:sz w:val="24"/>
-                <w:szCs w:val="24"/>
               </w:rPr>
             </w:pPr>
             <w:proofErr w:type="spellStart"/>
             <w:r>
               <w:rPr>
                 <w:rFonts w:ascii="Times New Roman" w:hAnsi="Times New Roman" w:cs="Times New Roman"/>
-                <w:sz w:val="24"/>
-                <w:szCs w:val="24"/>
               </w:rPr>
               <w:t>Ketua</w:t>
             </w:r>
@@ -1089,8 +1081,6 @@
             <w:r>
               <w:rPr>
                 <w:rFonts w:ascii="Times New Roman" w:hAnsi="Times New Roman" w:cs="Times New Roman"/>
-                <w:sz w:val="24"/>
-                <w:szCs w:val="24"/>
               </w:rPr>
               <w:t xml:space="preserve"> Program Studi,</w:t>
             </w:r>
@@ -1108,33 +1098,32 @@
           </w:tcPr>
           <w:p>
             <w:pPr>
+              <w:spacing w:line="360" w:lineRule="auto"/>
               <w:jc w:val="center"/>
               <w:rPr>
                 <w:rFonts w:ascii="Times New Roman" w:hAnsi="Times New Roman" w:cs="Times New Roman"/>
                 <w:sz w:val="24"/>
                 <w:szCs w:val="24"/>
+                <w:lang w:val="fi-FI"/>
               </w:rPr>
             </w:pPr>
             <w:r>
               <w:rPr>
-                <w:rFonts w:ascii="Times New Roman" w:hAnsi="Times New Roman" w:cs="Times New Roman"/>
                 <w:noProof/>
-                <w:sz w:val="24"/>
-                <w:szCs w:val="24"/>
               </w:rPr>
               <w:drawing>
-                <wp:anchor distT="0" distB="0" distL="114300" distR="114300" simplePos="0" relativeHeight="251658240" behindDoc="0" locked="0" layoutInCell="1" allowOverlap="1" wp14:anchorId="40FBD11D" wp14:editId="4501B98C">
+                <wp:anchor distT="0" distB="0" distL="114300" distR="114300" simplePos="0" relativeHeight="251659264" behindDoc="0" locked="0" layoutInCell="1" allowOverlap="1" wp14:anchorId="597D15EC" wp14:editId="2716B01F">
                   <wp:simplePos x="0" y="0"/>
                   <wp:positionH relativeFrom="column">
-                    <wp:posOffset>-76835</wp:posOffset>
+                    <wp:posOffset>574040</wp:posOffset>
                   </wp:positionH>
                   <wp:positionV relativeFrom="paragraph">
-                    <wp:posOffset>228600</wp:posOffset>
+                    <wp:posOffset>-3810</wp:posOffset>
                   </wp:positionV>
-                  <wp:extent cx="945515" cy="499745"/>
+                  <wp:extent cx="1456055" cy="923925"/>
                   <wp:effectExtent l="0" t="0" r="0" b="0"/>
-                  <wp:wrapNone/>
-                  <wp:docPr id="1015064922" name="Picture 1"/>
+                  <wp:wrapSquare wrapText="bothSides"/>
+                  <wp:docPr id="1345929849" name="Picture 2"/>
                   <wp:cNvGraphicFramePr>
                     <a:graphicFrameLocks xmlns:a="http://schemas.openxmlformats.org/drawingml/2006/main" noChangeAspect="1"/>
                   </wp:cNvGraphicFramePr>
@@ -1142,13 +1131,77 @@
                     <a:graphicData uri="http://schemas.openxmlformats.org/drawingml/2006/picture">
                       <pic:pic xmlns:pic="http://schemas.openxmlformats.org/drawingml/2006/picture">
                         <pic:nvPicPr>
-                          <pic:cNvPr id="0" name="Picture 1"/>
+                          <pic:cNvPr id="0" name="Picture 3"/>
                           <pic:cNvPicPr>
                             <a:picLocks noChangeAspect="1" noChangeArrowheads="1"/>
                           </pic:cNvPicPr>
                         </pic:nvPicPr>
                         <pic:blipFill>
-                          <a:blip r:embed="rId5" cstate="print">
+                          <a:blip r:embed="rId5">
+                            <a:extLst>
+                              <a:ext uri="{28A0092B-C50C-407E-A947-70E740481C1C}">
+                                <a14:useLocalDpi xmlns:a14="http://schemas.microsoft.com/office/drawing/2010/main" val="0"/>
+                              </a:ext>
+                            </a:extLst>
+                          </a:blip>
+                          <a:srcRect l="18018" t="1221" b="1221"/>
+                          <a:stretch>
+                            <a:fillRect/>
+                          </a:stretch>
+                        </pic:blipFill>
+                        <pic:spPr bwMode="auto">
+                          <a:xfrm>
+                            <a:off x="0" y="0"/>
+                            <a:ext cx="1456055" cy="923925"/>
+                          </a:xfrm>
+                          <a:prstGeom prst="rect">
+                            <a:avLst/>
+                          </a:prstGeom>
+                          <a:noFill/>
+                        </pic:spPr>
+                      </pic:pic>
+                    </a:graphicData>
+                  </a:graphic>
+                  <wp14:sizeRelH relativeFrom="margin">
+                    <wp14:pctWidth>0</wp14:pctWidth>
+                  </wp14:sizeRelH>
+                  <wp14:sizeRelV relativeFrom="margin">
+                    <wp14:pctHeight>0</wp14:pctHeight>
+                  </wp14:sizeRelV>
+                </wp:anchor>
+              </w:drawing>
+            </w:r>
+            <w:r>
+              <w:rPr>
+                <w:noProof/>
+              </w:rPr>
+              <w:drawing>
+                <wp:anchor distT="0" distB="0" distL="114300" distR="114300" simplePos="0" relativeHeight="251660288" behindDoc="1" locked="0" layoutInCell="1" allowOverlap="1" wp14:anchorId="2EBED7D3" wp14:editId="41EA8E30">
+                  <wp:simplePos x="0" y="0"/>
+                  <wp:positionH relativeFrom="column">
+                    <wp:posOffset>53975</wp:posOffset>
+                  </wp:positionH>
+                  <wp:positionV relativeFrom="paragraph">
+                    <wp:posOffset>87630</wp:posOffset>
+                  </wp:positionV>
+                  <wp:extent cx="1115060" cy="589280"/>
+                  <wp:effectExtent l="0" t="0" r="0" b="1270"/>
+                  <wp:wrapNone/>
+                  <wp:docPr id="315296588" name="Picture 1"/>
+                  <wp:cNvGraphicFramePr>
+                    <a:graphicFrameLocks xmlns:a="http://schemas.openxmlformats.org/drawingml/2006/main" noChangeAspect="1"/>
+                  </wp:cNvGraphicFramePr>
+                  <a:graphic xmlns:a="http://schemas.openxmlformats.org/drawingml/2006/main">
+                    <a:graphicData uri="http://schemas.openxmlformats.org/drawingml/2006/picture">
+                      <pic:pic xmlns:pic="http://schemas.openxmlformats.org/drawingml/2006/picture">
+                        <pic:nvPicPr>
+                          <pic:cNvPr id="0" name="Picture 4"/>
+                          <pic:cNvPicPr>
+                            <a:picLocks noChangeAspect="1" noChangeArrowheads="1"/>
+                          </pic:cNvPicPr>
+                        </pic:nvPicPr>
+                        <pic:blipFill>
+                          <a:blip r:embed="rId6">
                             <a:extLst>
                               <a:ext uri="{28A0092B-C50C-407E-A947-70E740481C1C}">
                                 <a14:useLocalDpi xmlns:a14="http://schemas.microsoft.com/office/drawing/2010/main" val="0"/>
@@ -1163,15 +1216,12 @@
                         <pic:spPr bwMode="auto">
                           <a:xfrm>
                             <a:off x="0" y="0"/>
-                            <a:ext cx="945515" cy="499745"/>
+                            <a:ext cx="1115060" cy="589280"/>
                           </a:xfrm>
                           <a:prstGeom prst="rect">
                             <a:avLst/>
                           </a:prstGeom>
                           <a:noFill/>
-                          <a:ln>
-                            <a:noFill/>
-                          </a:ln>
                         </pic:spPr>
                       </pic:pic>
                     </a:graphicData>
@@ -1185,103 +1235,53 @@
                 </wp:anchor>
               </w:drawing>
             </w:r>
-            <w:r>
+          </w:p>
+          <w:p>
+            <w:pPr>
+              <w:spacing w:line="360" w:lineRule="auto"/>
+              <w:jc w:val="center"/>
               <w:rPr>
                 <w:rFonts w:ascii="Times New Roman" w:hAnsi="Times New Roman" w:cs="Times New Roman"/>
-                <w:noProof/>
-                <w:sz w:val="24"/>
-                <w:szCs w:val="24"/>
                 <w:lang w:val="fi-FI"/>
               </w:rPr>
-              <w:drawing>
-                <wp:inline distT="0" distB="0" distL="0" distR="0" wp14:anchorId="6BA91486" wp14:editId="02F44B21">
-                  <wp:extent cx="1560830" cy="812554"/>
-                  <wp:effectExtent l="0" t="0" r="1270" b="6985"/>
-                  <wp:docPr id="1704703028" name="Picture 2"/>
-                  <wp:cNvGraphicFramePr>
-                    <a:graphicFrameLocks xmlns:a="http://schemas.openxmlformats.org/drawingml/2006/main" noChangeAspect="1"/>
-                  </wp:cNvGraphicFramePr>
-                  <a:graphic xmlns:a="http://schemas.openxmlformats.org/drawingml/2006/main">
-                    <a:graphicData uri="http://schemas.openxmlformats.org/drawingml/2006/picture">
-                      <pic:pic xmlns:pic="http://schemas.openxmlformats.org/drawingml/2006/picture">
-                        <pic:nvPicPr>
-                          <pic:cNvPr id="1704703028" name="Picture 1704703028"/>
-                          <pic:cNvPicPr/>
-                        </pic:nvPicPr>
-                        <pic:blipFill rotWithShape="1">
-                          <a:blip r:embed="rId6" cstate="print">
-                            <a:extLst>
-                              <a:ext uri="{28A0092B-C50C-407E-A947-70E740481C1C}">
-                                <a14:useLocalDpi xmlns:a14="http://schemas.microsoft.com/office/drawing/2010/main" val="0"/>
-                              </a:ext>
-                            </a:extLst>
-                          </a:blip>
-                          <a:srcRect l="16801" t="18792" r="10725" b="10448"/>
-                          <a:stretch/>
-                        </pic:blipFill>
-                        <pic:spPr bwMode="auto">
-                          <a:xfrm>
-                            <a:off x="0" y="0"/>
-                            <a:ext cx="1574740" cy="819795"/>
-                          </a:xfrm>
-                          <a:prstGeom prst="rect">
-                            <a:avLst/>
-                          </a:prstGeom>
-                          <a:ln>
-                            <a:noFill/>
-                          </a:ln>
-                          <a:extLst>
-                            <a:ext uri="{53640926-AAD7-44D8-BBD7-CCE9431645EC}">
-                              <a14:shadowObscured xmlns:a14="http://schemas.microsoft.com/office/drawing/2010/main"/>
-                            </a:ext>
-                          </a:extLst>
-                        </pic:spPr>
-                      </pic:pic>
-                    </a:graphicData>
-                  </a:graphic>
-                </wp:inline>
-              </w:drawing>
-            </w:r>
+            </w:pPr>
           </w:p>
-        </w:tc>
-      </w:tr>
-      <w:tr>
-        <w:trPr>
-          <w:jc w:val="right"/>
-        </w:trPr>
-        <w:tc>
-          <w:tcPr>
-            <w:tcW w:w="3426" w:type="dxa"/>
-            <w:vAlign w:val="center"/>
-          </w:tcPr>
           <w:p>
             <w:pPr>
+              <w:spacing w:line="360" w:lineRule="auto"/>
+              <w:jc w:val="center"/>
+              <w:rPr>
+                <w:rFonts w:ascii="Times New Roman" w:hAnsi="Times New Roman" w:cs="Times New Roman"/>
+                <w:lang w:val="fi-FI"/>
+              </w:rPr>
+            </w:pPr>
+          </w:p>
+          <w:p>
+            <w:pPr>
+              <w:spacing w:line="360" w:lineRule="auto"/>
+              <w:jc w:val="center"/>
+              <w:rPr>
+                <w:rFonts w:ascii="Times New Roman" w:hAnsi="Times New Roman" w:cs="Times New Roman"/>
+                <w:lang w:val="fi-FI"/>
+              </w:rPr>
+            </w:pPr>
+          </w:p>
+          <w:p>
+            <w:pPr>
+              <w:spacing w:line="360" w:lineRule="auto"/>
               <w:jc w:val="center"/>
               <w:rPr>
                 <w:rFonts w:ascii="Times New Roman" w:hAnsi="Times New Roman" w:cs="Times New Roman"/>
                 <w:noProof/>
-                <w:sz w:val="24"/>
-                <w:szCs w:val="24"/>
                 <w:lang w:val="fi-FI"/>
               </w:rPr>
             </w:pPr>
             <w:r>
               <w:rPr>
                 <w:rFonts w:ascii="Times New Roman" w:hAnsi="Times New Roman" w:cs="Times New Roman"/>
-                <w:sz w:val="24"/>
-                <w:szCs w:val="24"/>
                 <w:lang w:val="fi-FI"/>
               </w:rPr>
-              <w:t>Mina Ismu Rahayu, M.T</w:t>
-            </w:r>
-            <w:r>
-              <w:rPr>
-                <w:rFonts w:ascii="Times New Roman" w:hAnsi="Times New Roman" w:cs="Times New Roman"/>
-                <w:sz w:val="24"/>
-                <w:szCs w:val="24"/>
-                <w:lang w:val="fi-FI"/>
-              </w:rPr>
-              <w:t>.</w:t>
+              <w:t>Mina Ismu Rahayu, M.T.</w:t>
             </w:r>
           </w:p>
         </w:tc>
@@ -1331,7 +1331,7 @@
 </file>
 
 <file path=word/styles.xml><?xml version="1.0" encoding="utf-8"?>
-<w:styles xmlns:mc="http://schemas.openxmlformats.org/markup-compatibility/2006" xmlns:r="http://schemas.openxmlformats.org/officeDocument/2006/relationships" xmlns:w="http://schemas.openxmlformats.org/wordprocessingml/2006/main" xmlns:w14="http://schemas.microsoft.com/office/word/2010/wordml" xmlns:w15="http://schemas.microsoft.com/office/word/2012/wordml" xmlns:w16cex="http://schemas.microsoft.com/office/word/2018/wordml/cex" xmlns:w16cid="http://schemas.microsoft.com/office/word/2016/wordml/cid" xmlns:w16="http://schemas.microsoft.com/office/word/2018/wordml" xmlns:w16du="http://schemas.microsoft.com/office/word/2023/wordml/word16du" xmlns:w16sdtdh="http://schemas.microsoft.com/office/word/2020/wordml/sdtdatahash" xmlns:w16sdtfl="http://schemas.microsoft.com/office/word/2024/wordml/sdtformatlock" xmlns:w16se="http://schemas.microsoft.com/office/word/2015/wordml/symex" mc:Ignorable="w14 w15 w16se w16cid w16 w16cex w16sdtdh w16sdtfl w16du">
+<w:styles xmlns:mc="http://schemas.openxmlformats.org/markup-compatibility/2006" xmlns:r="http://schemas.openxmlformats.org/officeDocument/2006/relationships" xmlns:w="http://schemas.openxmlformats.org/wordprocessingml/2006/main" xmlns:w14="http://schemas.microsoft.com/office/word/2010/wordml" xmlns:w15="http://schemas.microsoft.com/office/word/2012/wordml" xmlns:w16cex="http://schemas.microsoft.com/office/word/2018/wordml/cex" xmlns:w16cid="http://schemas.microsoft.com/office/word/2016/wordml/cid" xmlns:w16="http://schemas.microsoft.com/office/word/2018/wordml" xmlns:w16du="http://schemas.microsoft.com/office/word/2023/wordml/word16du" xmlns:w16sdtdh="http://schemas.microsoft.com/office/word/2020/wordml/sdtdatahash" xmlns:w16se="http://schemas.microsoft.com/office/word/2015/wordml/symex" mc:Ignorable="w14 w15 w16se w16cid w16 w16cex w16sdtdh w16du">
   <w:docDefaults>
     <w:rPrDefault>
       <w:rPr>

</xml_diff>